<commit_message>
fix: restore daily application automation integrity
</commit_message>
<xml_diff>
--- a/applications/owner-com/tailored_resumes/2026-03-09_owner-com_software-engineer-mobile.docx
+++ b/applications/owner-com/tailored_resumes/2026-03-09_owner-com_software-engineer-mobile.docx
@@ -34,7 +34,7 @@
     </w:p>
     <w:p>
       <w:r>
-        <w:t xml:space="preserve">Senior AI and Full-Stack Engineer with 15+ years of professional software development experience and 6+ years of significant full-stack development responsibility. Focused on building production AI systems: LLM gateways, agent/tool execution, retrieval-augmented workflows, and cloud-native services on Google Cloud Platform and AWS. Provides technical leadership across architecture, code review, and AI adoption; mentors teams on reliability, cost/latency tradeoffs, and observability. Proven track record building scalable, secure, performant systems aligned with business objectives.</w:t>
+        <w:t xml:space="preserve">Senior AI and Full-Stack Engineer with 15+ years of professional software development experience and 6+ years of full-stack ownership. Delivers production AI systems with strong engineering fundamentals, operational rigor, and practical execution around api, cloud, reliability.</w:t>
       </w:r>
     </w:p>
     <w:p>
@@ -69,32 +69,22 @@
     </w:p>
     <w:p>
       <w:r>
-        <w:t xml:space="preserve">• AI Systems / Infra: distributed debugging, reliability, observability (logs/metrics/traces), cost/latency tuning, incident-minded engineering</w:t>
-      </w:r>
-    </w:p>
-    <w:p>
-      <w:r>
-        <w:t xml:space="preserve">• L7 traffic &amp; platform: API gateways, HTTP/2 concepts, service mesh fundamentals (Istio/Envoy), production hardening and rollout safety</w:t>
-      </w:r>
-    </w:p>
-    <w:p>
-      <w:r>
-        <w:t xml:space="preserve">• Full-Stack Development: React Native (New Architecture, Fabric), Node.js, REST APIs, microservices, cloud-based systems</w:t>
-      </w:r>
-    </w:p>
-    <w:p>
-      <w:r>
-        <w:t xml:space="preserve">• Cloud Platforms: GCP (Vertex AI, Dialogflow, BigQuery, Cloud Functions, Cloud Build), AWS (Lambda, Bedrock, S3)</w:t>
-      </w:r>
-    </w:p>
-    <w:p>
-      <w:r>
-        <w:t xml:space="preserve">• DevOps &amp; CI/CD: GitHub Actions, GCP Cloud Build, CircleCI, Azure DevOps, Gradle, containerization</w:t>
-      </w:r>
-    </w:p>
-    <w:p>
-      <w:r>
-        <w:t xml:space="preserve">• Leadership: architecture reviews, code review, mentoring engineers, clear communication with engineers and stakeholders</w:t>
+        <w:t xml:space="preserve">• AI systems engineering: production delivery, reliability, observability, and practical architecture decisions</w:t>
+      </w:r>
+    </w:p>
+    <w:p>
+      <w:r>
+        <w:t xml:space="preserve">• Platform development: APIs, cloud services, CI/CD pipelines, and secure integration patterns</w:t>
+      </w:r>
+    </w:p>
+    <w:p>
+      <w:r>
+        <w:t xml:space="preserve">• Technical focus areas: api, cloud, reliability</w:t>
+      </w:r>
+    </w:p>
+    <w:p>
+      <w:r>
+        <w:t xml:space="preserve">• Execution discipline: measurable outcomes, stakeholder communication, and iterative improvement</w:t>
       </w:r>
     </w:p>
     <w:p>
@@ -114,12 +104,12 @@
     </w:p>
     <w:p>
       <w:r>
-        <w:t xml:space="preserve">Led design and delivery of end-to-end AI features from prototype to production, including LLM-backed search, personalized recommendations, and conversational AI assistant serving millions of users monthly</w:t>
-      </w:r>
-    </w:p>
-    <w:p>
-      <w:r>
-        <w:t xml:space="preserve">Architected and deployed Dialogflow CX-based conversational agents integrated with Vertex AI for intent classification and dynamic response generation, reducing customer service load by 35%</w:t>
+        <w:t xml:space="preserve">Owned end-to-end delivery of AI features from prototype to production, including LLM-backed search, personalized recommendations, and conversational AI assistant experiences serving millions of users monthly</w:t>
+      </w:r>
+    </w:p>
+    <w:p>
+      <w:r>
+        <w:t xml:space="preserve">Architected and deployed Dialogflow CX-based conversational agents integrated with Vertex AI for intent classification and dynamic response generation, reducing customer service load by  35%</w:t>
       </w:r>
     </w:p>
     <w:p>
@@ -279,7 +269,7 @@
     </w:p>
     <w:p>
       <w:r>
-        <w:t xml:space="preserve">• Autonomous AI trading system (github.com/IgorGanapolsky/trading): multi-model LLM gateway with Tetrate Agent Router Service (TARS), cost-aware routing and provider fallbacks, and self-healing CI for continuous reliability</w:t>
+        <w:t xml:space="preserve">• Autonomous AI trading system (github.com/IgorGanapolsky/trading): multi-model LLM gateway with API-first integration design, Tetrate Agent Router Service (TARS), cost-aware routing/provider fallbacks, and self-healing CI for continuous reliability</w:t>
       </w:r>
     </w:p>
     <w:p>
@@ -289,7 +279,7 @@
     </w:p>
     <w:p>
       <w:r>
-        <w:t xml:space="preserve">• Field-support GenAI chatbot for CNH (Gemini, Vertex AI, Dialogflow, BigQuery) – reduced support volume 40%</w:t>
+        <w:t xml:space="preserve">• Field-support GenAI chatbot for CNH (Gemini, Vertex AI, Dialogflow, BigQuery) – reduced support volume  40%</w:t>
       </w:r>
     </w:p>
     <w:p>

</xml_diff>

<commit_message>
fix: restore daily application automation integrity (#23)
Co-authored-by: Igor Ganapolsky <igor.ganapolsky@gmail.com>
</commit_message>
<xml_diff>
--- a/applications/owner-com/tailored_resumes/2026-03-09_owner-com_software-engineer-mobile.docx
+++ b/applications/owner-com/tailored_resumes/2026-03-09_owner-com_software-engineer-mobile.docx
@@ -34,7 +34,7 @@
     </w:p>
     <w:p>
       <w:r>
-        <w:t xml:space="preserve">Senior AI and Full-Stack Engineer with 15+ years of professional software development experience and 6+ years of significant full-stack development responsibility. Focused on building production AI systems: LLM gateways, agent/tool execution, retrieval-augmented workflows, and cloud-native services on Google Cloud Platform and AWS. Provides technical leadership across architecture, code review, and AI adoption; mentors teams on reliability, cost/latency tradeoffs, and observability. Proven track record building scalable, secure, performant systems aligned with business objectives.</w:t>
+        <w:t xml:space="preserve">Senior AI and Full-Stack Engineer with 15+ years of professional software development experience and 6+ years of full-stack ownership. Delivers production AI systems with strong engineering fundamentals, operational rigor, and practical execution around api, cloud, reliability.</w:t>
       </w:r>
     </w:p>
     <w:p>
@@ -69,32 +69,22 @@
     </w:p>
     <w:p>
       <w:r>
-        <w:t xml:space="preserve">• AI Systems / Infra: distributed debugging, reliability, observability (logs/metrics/traces), cost/latency tuning, incident-minded engineering</w:t>
-      </w:r>
-    </w:p>
-    <w:p>
-      <w:r>
-        <w:t xml:space="preserve">• L7 traffic &amp; platform: API gateways, HTTP/2 concepts, service mesh fundamentals (Istio/Envoy), production hardening and rollout safety</w:t>
-      </w:r>
-    </w:p>
-    <w:p>
-      <w:r>
-        <w:t xml:space="preserve">• Full-Stack Development: React Native (New Architecture, Fabric), Node.js, REST APIs, microservices, cloud-based systems</w:t>
-      </w:r>
-    </w:p>
-    <w:p>
-      <w:r>
-        <w:t xml:space="preserve">• Cloud Platforms: GCP (Vertex AI, Dialogflow, BigQuery, Cloud Functions, Cloud Build), AWS (Lambda, Bedrock, S3)</w:t>
-      </w:r>
-    </w:p>
-    <w:p>
-      <w:r>
-        <w:t xml:space="preserve">• DevOps &amp; CI/CD: GitHub Actions, GCP Cloud Build, CircleCI, Azure DevOps, Gradle, containerization</w:t>
-      </w:r>
-    </w:p>
-    <w:p>
-      <w:r>
-        <w:t xml:space="preserve">• Leadership: architecture reviews, code review, mentoring engineers, clear communication with engineers and stakeholders</w:t>
+        <w:t xml:space="preserve">• AI systems engineering: production delivery, reliability, observability, and practical architecture decisions</w:t>
+      </w:r>
+    </w:p>
+    <w:p>
+      <w:r>
+        <w:t xml:space="preserve">• Platform development: APIs, cloud services, CI/CD pipelines, and secure integration patterns</w:t>
+      </w:r>
+    </w:p>
+    <w:p>
+      <w:r>
+        <w:t xml:space="preserve">• Technical focus areas: api, cloud, reliability</w:t>
+      </w:r>
+    </w:p>
+    <w:p>
+      <w:r>
+        <w:t xml:space="preserve">• Execution discipline: measurable outcomes, stakeholder communication, and iterative improvement</w:t>
       </w:r>
     </w:p>
     <w:p>
@@ -114,12 +104,12 @@
     </w:p>
     <w:p>
       <w:r>
-        <w:t xml:space="preserve">Led design and delivery of end-to-end AI features from prototype to production, including LLM-backed search, personalized recommendations, and conversational AI assistant serving millions of users monthly</w:t>
-      </w:r>
-    </w:p>
-    <w:p>
-      <w:r>
-        <w:t xml:space="preserve">Architected and deployed Dialogflow CX-based conversational agents integrated with Vertex AI for intent classification and dynamic response generation, reducing customer service load by 35%</w:t>
+        <w:t xml:space="preserve">Owned end-to-end delivery of AI features from prototype to production, including LLM-backed search, personalized recommendations, and conversational AI assistant experiences serving millions of users monthly</w:t>
+      </w:r>
+    </w:p>
+    <w:p>
+      <w:r>
+        <w:t xml:space="preserve">Architected and deployed Dialogflow CX-based conversational agents integrated with Vertex AI for intent classification and dynamic response generation, reducing customer service load by  35%</w:t>
       </w:r>
     </w:p>
     <w:p>
@@ -279,7 +269,7 @@
     </w:p>
     <w:p>
       <w:r>
-        <w:t xml:space="preserve">• Autonomous AI trading system (github.com/IgorGanapolsky/trading): multi-model LLM gateway with Tetrate Agent Router Service (TARS), cost-aware routing and provider fallbacks, and self-healing CI for continuous reliability</w:t>
+        <w:t xml:space="preserve">• Autonomous AI trading system (github.com/IgorGanapolsky/trading): multi-model LLM gateway with API-first integration design, Tetrate Agent Router Service (TARS), cost-aware routing/provider fallbacks, and self-healing CI for continuous reliability</w:t>
       </w:r>
     </w:p>
     <w:p>
@@ -289,7 +279,7 @@
     </w:p>
     <w:p>
       <w:r>
-        <w:t xml:space="preserve">• Field-support GenAI chatbot for CNH (Gemini, Vertex AI, Dialogflow, BigQuery) – reduced support volume 40%</w:t>
+        <w:t xml:space="preserve">• Field-support GenAI chatbot for CNH (Gemini, Vertex AI, Dialogflow, BigQuery) – reduced support volume  40%</w:t>
       </w:r>
     </w:p>
     <w:p>

</xml_diff>